<commit_message>
docs: update proposal document docx
</commit_message>
<xml_diff>
--- a/docs/proposal.docx
+++ b/docs/proposal.docx
@@ -50,7 +50,7 @@
           <w:szCs w:val="36"/>
           <w:rtl w:val="0"/>
         </w:rPr>
-        <w:t xml:space="preserve">Manufacturing Defect Metal Detection using CNN and Grad-CAM</w:t>
+        <w:t xml:space="preserve">Manufacturing Defect Metal Surface Detection using CNN and Grad-CAM</w:t>
       </w:r>
       <w:r>
         <w:rPr>
@@ -1149,11 +1149,11 @@
           <w:bCs w:val="1"/>
           <w:i w:val="0"/>
           <w:iCs w:val="0"/>
-          <w:sz w:val="24"/>
-          <w:szCs w:val="24"/>
-        </w:rPr>
-      </w:pPr>
-      <w:bookmarkStart w:colFirst="0" w:colLast="0" w:name="_gf3obwp20j6w" w:id="8"/>
+          <w:sz w:val="26"/>
+          <w:szCs w:val="26"/>
+        </w:rPr>
+      </w:pPr>
+      <w:bookmarkStart w:colFirst="0" w:colLast="0" w:name="_owna9tjc40ge" w:id="8"/>
       <w:bookmarkEnd w:id="8"/>
       <w:r>
         <w:rPr>
@@ -1161,8 +1161,8 @@
           <w:bCs w:val="1"/>
           <w:i w:val="0"/>
           <w:iCs w:val="0"/>
-          <w:sz w:val="24"/>
-          <w:szCs w:val="24"/>
+          <w:sz w:val="26"/>
+          <w:szCs w:val="26"/>
           <w:rtl w:val="0"/>
         </w:rPr>
         <w:t xml:space="preserve">3.1 Source</w:t>
@@ -1177,12 +1177,7 @@
         <w:rPr>
           <w:rtl w:val="0"/>
         </w:rPr>
-        <w:t xml:space="preserve">The study will use the NEU Surface Defect Dataset, a publicly available dataset commonly used for steel surface defect classification. It contains grayscale images of hot-rolled steel strip surfaces with six defect classes: crazing, inclusion, patches, pitted surface, rolled-in scale, and scratches [3], [7]. The dataset will be accessed through Kaggle for convenient download and management [3].</w:t>
-      </w:r>
-      <w:r>
-        <w:rPr>
-          <w:rtl w:val="0"/>
-        </w:rPr>
+        <w:t xml:space="preserve">The study will use two publicly available datasets for metal surface defect classification: the NEU Surface Defect Dataset and the Aluminum Profile Surface Defects Data Set. The NEU Surface Defect Dataset is commonly used for steel surface defect classification and contains grayscale images of hot-rolled steel strip surfaces with six defect classes: crazing, inclusion, patches, pitted surface, rolled-in scale, and scratches [3], [7]. In addition, the Aluminum Profile Surface Defects Data Set contains surface images of aluminum profiles with defect categories that are useful for extending the study beyond steel-only inspection [9]. The NEU dataset will be accessed through Kaggle for convenient download and management [3], while the aluminum dataset will also be accessed through Kaggle [9].</w:t>
       </w:r>
     </w:p>
     <w:p>
@@ -1192,24 +1187,20 @@
         <w:spacing w:after="80" w:before="280" w:lineRule="auto"/>
         <w:jc w:val="both"/>
         <w:rPr>
-          <w:b w:val="1"/>
-          <w:bCs w:val="1"/>
-          <w:i w:val="0"/>
-          <w:iCs w:val="0"/>
-          <w:sz w:val="24"/>
-          <w:szCs w:val="24"/>
-        </w:rPr>
-      </w:pPr>
-      <w:bookmarkStart w:colFirst="0" w:colLast="0" w:name="_g7ptw5tk4lb3" w:id="9"/>
+          <w:i w:val="0"/>
+          <w:iCs w:val="0"/>
+          <w:sz w:val="26"/>
+          <w:szCs w:val="26"/>
+        </w:rPr>
+      </w:pPr>
+      <w:bookmarkStart w:colFirst="0" w:colLast="0" w:name="_nkdbkpwc5j7l" w:id="9"/>
       <w:bookmarkEnd w:id="9"/>
       <w:r>
         <w:rPr>
-          <w:b w:val="1"/>
-          <w:bCs w:val="1"/>
-          <w:i w:val="0"/>
-          <w:iCs w:val="0"/>
-          <w:sz w:val="24"/>
-          <w:szCs w:val="24"/>
+          <w:i w:val="0"/>
+          <w:iCs w:val="0"/>
+          <w:sz w:val="26"/>
+          <w:szCs w:val="26"/>
           <w:rtl w:val="0"/>
         </w:rPr>
         <w:t xml:space="preserve">3.2 License and Consent</w:t>
@@ -1224,7 +1215,7 @@
         <w:rPr>
           <w:rtl w:val="0"/>
         </w:rPr>
-        <w:t xml:space="preserve">The dataset is publicly available for research and educational use through Kaggle [3]. Since it contains only industrial surface images and does not include human participants, personal records, or sensitive information, no direct privacy or personal consent issues are involved in the study.</w:t>
+        <w:t xml:space="preserve">Both datasets are publicly available through online dataset platforms and are intended for research and educational use [3], [9]. Since the datasets contain only industrial surface images and do not involve human participants, personal records, or sensitive information, no direct privacy or consent issues are involved in the study. The ethical concerns of the study are therefore focused more on responsible dataset use, documentation, and proper interpretation of model results.</w:t>
       </w:r>
     </w:p>
     <w:p>
@@ -1234,20 +1225,16 @@
         <w:spacing w:after="80" w:before="280" w:lineRule="auto"/>
         <w:jc w:val="both"/>
         <w:rPr>
-          <w:b w:val="1"/>
-          <w:bCs w:val="1"/>
           <w:i w:val="0"/>
           <w:iCs w:val="0"/>
           <w:sz w:val="26"/>
           <w:szCs w:val="26"/>
         </w:rPr>
       </w:pPr>
-      <w:bookmarkStart w:colFirst="0" w:colLast="0" w:name="_iom61y2crxit" w:id="10"/>
+      <w:bookmarkStart w:colFirst="0" w:colLast="0" w:name="_xa9stvri51ro" w:id="10"/>
       <w:bookmarkEnd w:id="10"/>
       <w:r>
         <w:rPr>
-          <w:b w:val="1"/>
-          <w:bCs w:val="1"/>
           <w:i w:val="0"/>
           <w:iCs w:val="0"/>
           <w:sz w:val="26"/>
@@ -1266,7 +1253,18 @@
         <w:rPr>
           <w:rtl w:val="0"/>
         </w:rPr>
-        <w:t xml:space="preserve">The dataset is representative of the study because it focuses specifically on steel surface defects, which aligns with the intended scope of the proposed system [3], [7]. However, it is limited to one material type and six defect categories. As a result, the findings of the study may be more applicable to steel surface inspection than to other manufacturing materials or industrial environments.</w:t>
+        <w:t xml:space="preserve">The selected datasets are representative of the study because they both focus on industrial surface defects, which aligns with the intended scope of the proposed system. The NEU dataset is appropriate for steel surface defect classification, while the aluminum dataset extends the study to aluminum profile defect inspection [3], [7], [9]. Using both datasets improves the diversity of the image samples and allows the system to be tested on more than one type of metal surface. However, the datasets are still limited to specific acquisition conditions, predefined defect classes, and controlled image collections. Because of this, the findings of the study may be more applicable to steel and aluminum surface inspection than to all manufacturing materials or real-world industrial environments.</w:t>
+      </w:r>
+    </w:p>
+    <w:p>
+      <w:pPr>
+        <w:spacing w:after="240" w:before="240" w:lineRule="auto"/>
+        <w:rPr/>
+      </w:pPr>
+      <w:r>
+        <w:rPr>
+          <w:rtl w:val="0"/>
+        </w:rPr>
       </w:r>
     </w:p>
     <w:p>
@@ -2189,7 +2187,80 @@
     </w:p>
     <w:p>
       <w:pPr>
-        <w:spacing w:after="240" w:before="240" w:lineRule="auto"/>
+        <w:numPr>
+          <w:ilvl w:val="0"/>
+          <w:numId w:val="2"/>
+        </w:numPr>
+        <w:spacing w:after="240" w:before="240" w:lineRule="auto"/>
+        <w:ind w:left="360"/>
+        <w:jc w:val="left"/>
+        <w:rPr/>
+      </w:pPr>
+      <w:r>
+        <w:rPr>
+          <w:b w:val="1"/>
+          <w:bCs w:val="1"/>
+          <w:rtl w:val="0"/>
+        </w:rPr>
+        <w:t xml:space="preserve">[9]</w:t>
+      </w:r>
+      <w:r>
+        <w:rPr>
+          <w:rtl w:val="0"/>
+        </w:rPr>
+        <w:t xml:space="preserve"> Weihao Real, </w:t>
+      </w:r>
+      <w:r>
+        <w:rPr>
+          <w:i w:val="1"/>
+          <w:iCs w:val="1"/>
+          <w:rtl w:val="0"/>
+        </w:rPr>
+        <w:t xml:space="preserve">Aluminum Profile Surface Defects Data Set</w:t>
+      </w:r>
+      <w:r>
+        <w:rPr>
+          <w:rtl w:val="0"/>
+        </w:rPr>
+        <w:t xml:space="preserve">, Kaggle, available online: </w:t>
+      </w:r>
+      <w:r>
+        <w:rPr>
+          <w:rtl w:val="0"/>
+        </w:rPr>
+        <w:t xml:space="preserve">https://www.kaggle.com/datasets/weihaoreal/aluminum-profile-surface-defects-data-set/data</w:t>
+      </w:r>
+    </w:p>
+    <w:p>
+      <w:pPr>
+        <w:spacing w:after="240" w:before="240" w:lineRule="auto"/>
+        <w:ind w:left="360" w:firstLine="0"/>
+        <w:jc w:val="left"/>
+        <w:rPr/>
+      </w:pPr>
+      <w:r>
+        <w:rPr>
+          <w:rtl w:val="0"/>
+        </w:rPr>
+      </w:r>
+    </w:p>
+    <w:p>
+      <w:pPr>
+        <w:spacing w:after="240" w:before="240" w:lineRule="auto"/>
+        <w:ind w:left="360" w:firstLine="0"/>
+        <w:jc w:val="left"/>
+        <w:rPr/>
+      </w:pPr>
+      <w:r>
+        <w:rPr>
+          <w:rtl w:val="0"/>
+        </w:rPr>
+      </w:r>
+    </w:p>
+    <w:p>
+      <w:pPr>
+        <w:spacing w:after="240" w:before="240" w:lineRule="auto"/>
+        <w:ind w:left="360" w:firstLine="0"/>
         <w:jc w:val="left"/>
         <w:rPr/>
       </w:pPr>

</xml_diff>